<commit_message>
feat(marketing): newsletter workflow + June AYIW email output + library integration
Newsletter workflow documented in OPERATIONS.md (pandoc .md→docx, plain
LEFT/RIGHT COLUMN format, local file ownership). June AYIW companion email
HTML produced (EN+HE). register-library.js extended with slb_TargetDate +
slb_CampaignId fields; June newsletter entities registered. Calendar bug
logged (holiday filter). Newsletter issues folder reorganized.

Co-Authored-By: Claude Sonnet 4.6 <noreply@anthropic.com>
Claude-Session: https://claude.ai/code/session_011MCRXeXLFqeHWVmM6s1Cnq
</commit_message>
<xml_diff>
--- a/marketing/newsletter/issues/2026-05/2026-05-en.docx
+++ b/marketing/newsletter/issues/2026-05/2026-05-en.docx
@@ -2,7 +2,57 @@
 <file path=word/document.xml><?xml version="1.0" encoding="utf-8"?>
 <w:document xmlns:w="http://schemas.openxmlformats.org/wordprocessingml/2006/main" xmlns:m="http://schemas.openxmlformats.org/officeDocument/2006/math" xmlns:r="http://schemas.openxmlformats.org/officeDocument/2006/relationships" xmlns:o="urn:schemas-microsoft-com:office:office" xmlns:v="urn:schemas-microsoft-com:vml" xmlns:w10="urn:schemas-microsoft-com:office:word" xmlns:a="http://schemas.openxmlformats.org/drawingml/2006/main" xmlns:pic="http://schemas.openxmlformats.org/drawingml/2006/picture" xmlns:wp="http://schemas.openxmlformats.org/drawingml/2006/wordprocessingDrawing">
   <w:body>
-    <w:bookmarkStart w:id="10" w:name="find-the-wine-that-makes-the-moment"/>
+    <w:p>
+      <w:pPr>
+        <w:pStyle w:val="Title"/>
+      </w:pPr>
+      <w:r>
+        <w:t xml:space="preserve">Wine Talk — from Evyatar</w:t>
+      </w:r>
+    </w:p>
+    <w:bookmarkStart w:id="20" w:name="wine-talk-from-evyatar"/>
+    <w:p>
+      <w:pPr>
+        <w:pStyle w:val="Heading1"/>
+      </w:pPr>
+      <w:r>
+        <w:t xml:space="preserve">Wine Talk — from Evyatar</w:t>
+      </w:r>
+    </w:p>
+    <w:tbl>
+      <w:tblPr>
+        <w:tblStyle w:val="FigureTable"/>
+        <w:tblW w:type="auto" w:w="0"/>
+        <w:jc w:val="center"/>
+        <w:tblLook w:firstRow="0" w:lastRow="0" w:firstColumn="0" w:lastColumn="0"/>
+      </w:tblPr>
+      <w:tblGrid>
+        <w:gridCol w:w="7920"/>
+      </w:tblGrid>
+      <w:tr>
+        <w:tc>
+          <w:tcPr/>
+          <w:p>
+            <w:pPr>
+              <w:pStyle w:val="Compact"/>
+              <w:jc w:val="center"/>
+            </w:pPr>
+            <w:r>
+              <w:t xml:space="preserve">Vine to glass banner</w:t>
+            </w:r>
+          </w:p>
+        </w:tc>
+      </w:tr>
+    </w:tbl>
+    <w:p>
+      <w:pPr>
+        <w:pStyle w:val="ImageCaption"/>
+      </w:pPr>
+      <w:r>
+        <w:t xml:space="preserve">Vine to glass banner</w:t>
+      </w:r>
+    </w:p>
+    <w:bookmarkStart w:id="15" w:name="find-the-wine-that-makes-the-moment"/>
     <w:p>
       <w:pPr>
         <w:pStyle w:val="Heading2"/>
@@ -69,33 +119,277 @@
     </w:p>
     <w:p>
       <w:pPr>
+        <w:pStyle w:val="CaptionedFigure"/>
+      </w:pPr>
+      <w:r>
+        <w:drawing>
+          <wp:inline>
+            <wp:extent cx="1439999" cy="411428"/>
+            <wp:effectExtent b="0" l="0" r="0" t="0"/>
+            <wp:docPr descr="Evyatar’s signature" title="" id="10" name="Picture"/>
+            <a:graphic>
+              <a:graphicData uri="http://schemas.openxmlformats.org/drawingml/2006/picture">
+                <pic:pic>
+                  <pic:nvPicPr>
+                    <pic:cNvPr descr="../signature-en.svg" id="11" name="Picture"/>
+                    <pic:cNvPicPr>
+                      <a:picLocks noChangeArrowheads="1" noChangeAspect="1"/>
+                    </pic:cNvPicPr>
+                  </pic:nvPicPr>
+                  <pic:blipFill>
+                    <a:blip>
+                      <a:extLst>
+                        <a:ext uri="{28A0092B-C50C-407E-A947-70E740481C1C}">
+                          <a14:useLocalDpi xmlns:a14="http://schemas.microsoft.com/office/drawing/2010/main" val="0"/>
+                        </a:ext>
+                        <a:ext uri="{96DAC541-7B7A-43D3-8B79-37D633B846F1}">
+                          <asvg:svgBlip xmlns:asvg="http://schemas.microsoft.com/office/drawing/2016/SVG/main" r:embed="rId9"/>
+                        </a:ext>
+                      </a:extLst>
+                    </a:blip>
+                    <a:stretch>
+                      <a:fillRect/>
+                    </a:stretch>
+                  </pic:blipFill>
+                  <pic:spPr bwMode="auto">
+                    <a:xfrm>
+                      <a:off x="0" y="0"/>
+                      <a:ext cx="1439999" cy="411428"/>
+                    </a:xfrm>
+                    <a:prstGeom prst="rect">
+                      <a:avLst/>
+                    </a:prstGeom>
+                    <a:noFill/>
+                    <a:ln w="9525">
+                      <a:noFill/>
+                      <a:headEnd/>
+                      <a:tailEnd/>
+                    </a:ln>
+                  </pic:spPr>
+                </pic:pic>
+              </a:graphicData>
+            </a:graphic>
+          </wp:inline>
+        </w:drawing>
+      </w:r>
+    </w:p>
+    <w:p>
+      <w:pPr>
+        <w:pStyle w:val="ImageCaption"/>
+      </w:pPr>
+      <w:r>
+        <w:t xml:space="preserve">Evyatar’s signature</w:t>
+      </w:r>
+    </w:p>
+    <w:p>
+      <w:r>
+        <w:pict>
+          <v:rect style="width:0;height:1.5pt" o:hralign="center" o:hrstd="t" o:hr="t"/>
+        </w:pict>
+      </w:r>
+    </w:p>
+    <w:p>
+      <w:pPr>
+        <w:pStyle w:val="FirstParagraph"/>
+      </w:pPr>
+      <w:r>
+        <w:rPr>
+          <w:b/>
+          <w:bCs/>
+        </w:rPr>
+        <w:t xml:space="preserve">Read the full article</w:t>
+      </w:r>
+    </w:p>
+    <w:p>
+      <w:pPr>
+        <w:pStyle w:val="CaptionedFigure"/>
+      </w:pPr>
+      <w:r>
+        <w:drawing>
+          <wp:inline>
+            <wp:extent cx="1079999" cy="1079999"/>
+            <wp:effectExtent b="0" l="0" r="0" t="0"/>
+            <wp:docPr descr="Article QR" title="" id="13" name="Picture"/>
+            <a:graphic>
+              <a:graphicData uri="http://schemas.openxmlformats.org/drawingml/2006/picture">
+                <pic:pic>
+                  <pic:nvPicPr>
+                    <pic:cNvPr descr="../images/qr-context-en.png" id="14" name="Picture"/>
+                    <pic:cNvPicPr>
+                      <a:picLocks noChangeArrowheads="1" noChangeAspect="1"/>
+                    </pic:cNvPicPr>
+                  </pic:nvPicPr>
+                  <pic:blipFill>
+                    <a:blip r:embed="rId12"/>
+                    <a:stretch>
+                      <a:fillRect/>
+                    </a:stretch>
+                  </pic:blipFill>
+                  <pic:spPr bwMode="auto">
+                    <a:xfrm>
+                      <a:off x="0" y="0"/>
+                      <a:ext cx="1079999" cy="1079999"/>
+                    </a:xfrm>
+                    <a:prstGeom prst="rect">
+                      <a:avLst/>
+                    </a:prstGeom>
+                    <a:noFill/>
+                    <a:ln w="9525">
+                      <a:noFill/>
+                      <a:headEnd/>
+                      <a:tailEnd/>
+                    </a:ln>
+                  </pic:spPr>
+                </pic:pic>
+              </a:graphicData>
+            </a:graphic>
+          </wp:inline>
+        </w:drawing>
+      </w:r>
+    </w:p>
+    <w:p>
+      <w:pPr>
+        <w:pStyle w:val="ImageCaption"/>
+      </w:pPr>
+      <w:r>
+        <w:t xml:space="preserve">Article QR</w:t>
+      </w:r>
+    </w:p>
+    <w:p>
+      <w:pPr>
         <w:pStyle w:val="BodyText"/>
       </w:pPr>
       <w:r>
-        <w:t xml:space="preserve">— Evyatar</w:t>
+        <w:t xml:space="preserve">jlmwines.com/context</w:t>
+      </w:r>
+    </w:p>
+    <w:bookmarkEnd w:id="15"/>
+    <w:bookmarkStart w:id="19" w:name="making-wine-may-topic"/>
+    <w:p>
+      <w:pPr>
+        <w:pStyle w:val="Heading2"/>
+      </w:pPr>
+      <w:r>
+        <w:t xml:space="preserve">Making Wine — [May topic]</w:t>
+      </w:r>
+    </w:p>
+    <w:p>
+      <w:pPr>
+        <w:pStyle w:val="FirstParagraph"/>
+      </w:pPr>
+      <w:r>
+        <w:t xml:space="preserve">[ MAY MAKING WINE PLACEHOLDER — Evyatar’s first-person note on what’s happening in the vineyard and the winery in May. Replace with the edited May section from the 12-month draft once ready. Personal, conversational, 3–5 short paragraphs. Title topic gets filled in based on the entry’s actual subject (e.g.,</w:t>
+      </w:r>
+      <w:r>
+        <w:t xml:space="preserve"> </w:t>
+      </w:r>
+      <w:r>
+        <w:t xml:space="preserve">“Making Wine — Canopy Management”</w:t>
+      </w:r>
+      <w:r>
+        <w:t xml:space="preserve"> </w:t>
+      </w:r>
+      <w:r>
+        <w:t xml:space="preserve">or</w:t>
+      </w:r>
+      <w:r>
+        <w:t xml:space="preserve"> </w:t>
+      </w:r>
+      <w:r>
+        <w:t xml:space="preserve">“Making Wine — Bottling”</w:t>
+      </w:r>
+      <w:r>
+        <w:t xml:space="preserve">). ]</w:t>
+      </w:r>
+    </w:p>
+    <w:p>
+      <w:r>
+        <w:pict>
+          <v:rect style="width:0;height:1.5pt" o:hralign="center" o:hrstd="t" o:hr="t"/>
+        </w:pict>
+      </w:r>
+    </w:p>
+    <w:p>
+      <w:pPr>
+        <w:pStyle w:val="FirstParagraph"/>
+      </w:pPr>
+      <w:r>
+        <w:rPr>
+          <w:b/>
+          <w:bCs/>
+        </w:rPr>
+        <w:t xml:space="preserve">Special offers by email, and fascinating information about the world of wine.</w:t>
+      </w:r>
+    </w:p>
+    <w:p>
+      <w:pPr>
+        <w:pStyle w:val="CaptionedFigure"/>
+      </w:pPr>
+      <w:r>
+        <w:drawing>
+          <wp:inline>
+            <wp:extent cx="1079999" cy="1079999"/>
+            <wp:effectExtent b="0" l="0" r="0" t="0"/>
+            <wp:docPr descr="Signup QR" title="" id="17" name="Picture"/>
+            <a:graphic>
+              <a:graphicData uri="http://schemas.openxmlformats.org/drawingml/2006/picture">
+                <pic:pic>
+                  <pic:nvPicPr>
+                    <pic:cNvPr descr="../images/qr-signup-en.png" id="18" name="Picture"/>
+                    <pic:cNvPicPr>
+                      <a:picLocks noChangeArrowheads="1" noChangeAspect="1"/>
+                    </pic:cNvPicPr>
+                  </pic:nvPicPr>
+                  <pic:blipFill>
+                    <a:blip r:embed="rId16"/>
+                    <a:stretch>
+                      <a:fillRect/>
+                    </a:stretch>
+                  </pic:blipFill>
+                  <pic:spPr bwMode="auto">
+                    <a:xfrm>
+                      <a:off x="0" y="0"/>
+                      <a:ext cx="1079999" cy="1079999"/>
+                    </a:xfrm>
+                    <a:prstGeom prst="rect">
+                      <a:avLst/>
+                    </a:prstGeom>
+                    <a:noFill/>
+                    <a:ln w="9525">
+                      <a:noFill/>
+                      <a:headEnd/>
+                      <a:tailEnd/>
+                    </a:ln>
+                  </pic:spPr>
+                </pic:pic>
+              </a:graphicData>
+            </a:graphic>
+          </wp:inline>
+        </w:drawing>
+      </w:r>
+    </w:p>
+    <w:p>
+      <w:pPr>
+        <w:pStyle w:val="ImageCaption"/>
+      </w:pPr>
+      <w:r>
+        <w:t xml:space="preserve">Signup QR</w:t>
       </w:r>
     </w:p>
     <w:p>
       <w:pPr>
         <w:pStyle w:val="BodyText"/>
       </w:pPr>
-      <w:hyperlink r:id="rId9">
-        <w:r>
-          <w:rPr>
-            <w:rStyle w:val="Hyperlink"/>
-          </w:rPr>
-          <w:t xml:space="preserve">Read the full article →</w:t>
-        </w:r>
-      </w:hyperlink>
-    </w:p>
-    <w:bookmarkEnd w:id="10"/>
-    <w:bookmarkStart w:id="11" w:name="making-wine-canopy-season"/>
-    <w:p>
-      <w:pPr>
-        <w:pStyle w:val="Heading2"/>
-      </w:pPr>
-      <w:r>
-        <w:t xml:space="preserve">Making Wine — Canopy Season</w:t>
+      <w:r>
+        <w:t xml:space="preserve">jlmwines.com</w:t>
+      </w:r>
+    </w:p>
+    <w:bookmarkEnd w:id="19"/>
+    <w:p>
+      <w:r>
+        <w:pict>
+          <v:rect style="width:0;height:1.5pt" o:hralign="center" o:hrstd="t" o:hr="t"/>
+        </w:pict>
       </w:r>
     </w:p>
     <w:p>
@@ -103,26 +397,10 @@
         <w:pStyle w:val="FirstParagraph"/>
       </w:pPr>
       <w:r>
-        <w:t xml:space="preserve">May in the vineyard is about light. Buds have opened, shoots are stretching, and the leaves are starting to do their work. My job right now is making sure each vine has the right balance — enough leaves to ripen the grapes well, but not so much shade that the fruit hides.</w:t>
-      </w:r>
-    </w:p>
-    <w:p>
-      <w:pPr>
-        <w:pStyle w:val="BodyText"/>
-      </w:pPr>
-      <w:r>
-        <w:t xml:space="preserve">I’m walking the rows daily this month. Tucking shoots into the trellis wires, pulling extra growth where the canopy is too dense, watching for the first signs of flowering. By the time grapes begin to form, every vine should be set up for the rest of the season.</w:t>
-      </w:r>
-    </w:p>
-    <w:p>
-      <w:pPr>
-        <w:pStyle w:val="BodyText"/>
-      </w:pPr>
-      <w:r>
-        <w:t xml:space="preserve">The work feels small from week to week — but the wine you’ll drink next year is taking shape right now.</w:t>
-      </w:r>
-    </w:p>
-    <w:bookmarkEnd w:id="11"/>
+        <w:t xml:space="preserve">jlmwines.com</w:t>
+      </w:r>
+    </w:p>
+    <w:bookmarkEnd w:id="20"/>
     <w:sectPr>
       <w:footnotePr>
         <w:numRestart w:val="eachSect"/>

</xml_diff>